<commit_message>
Docs: passport flat-fee clarity + ERP-inclusive bundles; remove implausible 92% AI-adoption stat from all strategy artifacts
- GTM V2.0: Trust priced as flat annual fee per tier (orgs relied on selects tier, not per-check/per-org); new Build-inclusive bundles (Operate & Prove, Full Platform, Donor Impact Suite)
- One-pager: bundles table now includes the two Build bundles
- Strategy V4.0 / Grant MA / Product MA / Deck V12: drop '92% of nonprofits use AI / 7% impact'; lead with defensible funder-side gap (97% of foundations don't screen with AI; 1 in 10 accept AI-generated proposals)

Co-Authored-By: Claude Opus 4.8 <noreply@anthropic.com>
</commit_message>
<xml_diff>
--- a/docs/Kuja_Business_Strategy_2026-2028_V4.0.docx
+++ b/docs/Kuja_Business_Strategy_2026-2028_V4.0.docx
@@ -219,7 +219,7 @@
           <w:color w:val="1A1410"/>
           <w:sz w:val="21"/>
         </w:rPr>
-        <w:t>92% of nonprofits use AI but only 7% report major impact; 97% of foundations do not yet use AI to screen applications (Virtuous/Fundraising.AI 2026; Candid 2024). Legacy vendors are bolting AI onto rigid data models; Kuja is AI-native.</w:t>
+        <w:t>Foundation-side use is near zero — 97% of foundations do not yet use AI to screen applications, and only 1 in 10 funders would accept AI-generated proposal content (Candid 2024; Fundraising.AI 2026). Legacy vendors are bolting AI onto rigid data models; Kuja is AI-native, grounding every output in the customer’s own data with per-claim provenance.</w:t>
       </w:r>
     </w:p>
     <w:p>
@@ -387,7 +387,7 @@
           <w:color w:val="1A1410"/>
           <w:sz w:val="21"/>
         </w:rPr>
-        <w:t>AI adoption is universal (92% of nonprofits) but impact is not (7%), and foundation-side use is near zero (97% do not use AI to screen applications; only 1 in 10 funders would accept AI-generated proposal content). Legacy vendors — Submittable, Salesforce Einstein, Bonterra — are layering AI over rigid data models; none ships a per-claim provenance layer. The category is greenfield for an AI-native challenger that grounds every output in the customer’s own data and cites its sources. Governance tailwinds reinforce this: the $500M Humanity AI initiative (Ford, MacArthur + 8 funders) and the Gates Foundation’s $200M Anthropic partnership.</w:t>
+        <w:t>Foundation-side AI use is near zero: 97% of foundations do not use AI to screen applications, and only 1 in 10 funders would accept AI-generated proposal content (Candid 2024; Fundraising.AI 2026). Legacy vendors — Submittable, Salesforce Einstein, Bonterra — are layering AI over rigid data models; none ships a per-claim provenance layer. The category is greenfield for an AI-native challenger that grounds every output in the customer’s own data and cites its sources. Governance tailwinds reinforce this: the $500M Humanity AI initiative (Ford, MacArthur + 8 funders) and the Gates Foundation’s $200M Anthropic partnership.</w:t>
       </w:r>
     </w:p>
     <w:p>

</xml_diff>